<commit_message>
cve and p0 facts
</commit_message>
<xml_diff>
--- a/downloads/Evgeni_Gordeev_CV.docx
+++ b/downloads/Evgeni_Gordeev_CV.docx
@@ -463,6 +463,22 @@
           <w:strike w:val="0"/>
           <w:sz w:val="21"/>
         </w:rPr>
+        <w:t>Authored production P0 postmortems and the database backup and EC2 maintenance runbooks</w:t>
+      </w:r>
+    </w:p>
+    <w:p>
+      <w:pPr>
+        <w:pStyle w:val="ListBullet"/>
+        <w:spacing w:after="60" w:before="0"/>
+        <w:ind w:left="274" w:hanging="187"/>
+      </w:pPr>
+      <w:r>
+        <w:rPr>
+          <w:b w:val="0"/>
+          <w:i w:val="0"/>
+          <w:strike w:val="0"/>
+          <w:sz w:val="21"/>
+        </w:rPr>
         <w:t>Took over Granular Infrastructure, an IP acquisition with no staff, on Jenkins and EKS 1.23; upgraded it to 1.31 and onto the shared pipelines without a handover</w:t>
       </w:r>
     </w:p>
@@ -765,6 +781,22 @@
           <w:sz w:val="21"/>
         </w:rPr>
         <w:t>Integrated Sentry, AWS WAF and AWS Client VPN platform-wide, and released kube-asg-node-drainer for zero-downtime node rotation of single-replica workloads</w:t>
+      </w:r>
+    </w:p>
+    <w:p>
+      <w:pPr>
+        <w:pStyle w:val="ListBullet"/>
+        <w:spacing w:after="60" w:before="0"/>
+        <w:ind w:left="274" w:hanging="187"/>
+      </w:pPr>
+      <w:r>
+        <w:rPr>
+          <w:b w:val="0"/>
+          <w:i w:val="0"/>
+          <w:strike w:val="0"/>
+          <w:sz w:val="21"/>
+        </w:rPr>
+        <w:t>Closed known CVEs through dependency and runtime upgrades across about 10 services (e.g. Log4Shell, Spring4Shell)</w:t>
       </w:r>
     </w:p>
     <w:p>

</xml_diff>

<commit_message>
react pages in keycloak sso
</commit_message>
<xml_diff>
--- a/downloads/Evgeni_Gordeev_CV.docx
+++ b/downloads/Evgeni_Gordeev_CV.docx
@@ -888,6 +888,22 @@
           <w:sz w:val="21"/>
         </w:rPr>
         <w:t>Proposed Keycloak SSO with a 2019 proof of concept, led the build at 25% of my time with a developer at 50%, and migrated 12 web apps (2022) and 6 mobile apps (2023) with login-time user migration; no downtime; upgraded Keycloak yearly since 2022</w:t>
+      </w:r>
+    </w:p>
+    <w:p>
+      <w:pPr>
+        <w:pStyle w:val="ListBullet"/>
+        <w:spacing w:after="60" w:before="0"/>
+        <w:ind w:left="274" w:hanging="187"/>
+      </w:pPr>
+      <w:r>
+        <w:rPr>
+          <w:b w:val="0"/>
+          <w:i w:val="0"/>
+          <w:strike w:val="0"/>
+          <w:sz w:val="21"/>
+        </w:rPr>
+        <w:t>Maintained the custom React account theme through every Keycloak upgrade: login, EULA, grower list and CRUD, user list and CRUD</w:t>
       </w:r>
     </w:p>
     <w:p>

</xml_diff>